<commit_message>
crear cliente con tramite, representacion segun tramite
</commit_message>
<xml_diff>
--- a/public/templates/REPRESENTACION-MENORES.docx
+++ b/public/templates/REPRESENTACION-MENORES.docx
@@ -19,10 +19,10 @@
           <wp:anchor allowOverlap="1" behindDoc="0" distB="0" distT="0" distL="114300" distR="114300" hidden="0" layoutInCell="1" locked="0" relativeHeight="0" simplePos="0">
             <wp:simplePos x="0" y="0"/>
             <wp:positionH relativeFrom="column">
-              <wp:posOffset>-3809</wp:posOffset>
+              <wp:posOffset>-3808</wp:posOffset>
             </wp:positionH>
             <wp:positionV relativeFrom="paragraph">
-              <wp:posOffset>-4444</wp:posOffset>
+              <wp:posOffset>-4443</wp:posOffset>
             </wp:positionV>
             <wp:extent cx="1533525" cy="685800"/>
             <wp:effectExtent b="0" l="0" r="0" t="0"/>
@@ -471,7 +471,7 @@
           <w:szCs w:val="20"/>
           <w:rtl w:val="0"/>
         </w:rPr>
-        <w:t xml:space="preserve">ASUNTO:        REGULARIZACIÓN</w:t>
+        <w:t xml:space="preserve">ASUNTO:        {{TRAMITE}}</w:t>
       </w:r>
     </w:p>
     <w:p>
@@ -1476,7 +1476,7 @@
 
 <file path=customXML/item1.xml><?xml version="1.0" encoding="utf-8"?>
 <go:gDocsCustomXmlDataStorage xmlns:go="http://customooxmlschemas.google.com/" xmlns:r="http://schemas.openxmlformats.org/officeDocument/2006/relationships" uri="GoogleDocsCustomDataVersion2">
-  <go:docsCustomData xmlns:go="http://customooxmlschemas.google.com/" roundtripDataSignature="AMtx7mjVQoDVyI16KxJcTcH1nyTq+djR/Q==">CgMxLjA4AHIhMWpJUjk2ZEVxNnY1VE4yQ3RQTXJPMXJrNDFNbTZVeWc3</go:docsCustomData>
+  <go:docsCustomData xmlns:go="http://customooxmlschemas.google.com/" roundtripDataSignature="AMtx7mj1IKL9kXPnuARIqACLmkbX9M+baw==">CgMxLjA4AHIhMThOZ0k4NW1UMmJ2dVBJX2JRLUM3SlhPdkZrb3JMTU9W</go:docsCustomData>
 </go:gDocsCustomXmlDataStorage>
 </file>
 

</xml_diff>